<commit_message>
raport: clock and hardware configuration added
</commit_message>
<xml_diff>
--- a/doc/raport_KeyboardHero_master.docx
+++ b/doc/raport_KeyboardHero_master.docx
@@ -78,7 +78,7 @@
           <w:rFonts w:hint="eastAsia"/>
           <w:noProof/>
         </w:rPr>
-        <w:t>11.08.2026</w:t>
+        <w:t>13.08.2026</w:t>
       </w:r>
       <w:r>
         <w:fldChar w:fldCharType="end"/>
@@ -2790,9 +2790,6 @@
     <w:p>
       <w:pPr>
         <w:pStyle w:val="Textbody"/>
-        <w:rPr>
-          <w:rFonts w:hint="eastAsia"/>
-        </w:rPr>
       </w:pPr>
       <w:r>
         <w:t xml:space="preserve">Osoba odpowiedzialna: </w:t>
@@ -2806,86 +2803,36 @@
         <w:pStyle w:val="Textbody"/>
         <w:rPr>
           <w:rFonts w:hint="eastAsia"/>
-          <w:i/>
-          <w:iCs/>
-          <w:sz w:val="20"/>
-          <w:szCs w:val="20"/>
-        </w:rPr>
-      </w:pPr>
-      <w:r>
-        <w:rPr>
-          <w:i/>
-          <w:iCs/>
-          <w:sz w:val="20"/>
-          <w:szCs w:val="20"/>
-        </w:rPr>
-        <w:t>Informacja na temat źródła sygnału zegarowego, używanych częstotliwości zegara w całym układzie.</w:t>
-      </w:r>
-    </w:p>
-    <w:p>
-      <w:pPr>
-        <w:pStyle w:val="Textbody"/>
-        <w:rPr>
-          <w:rFonts w:hint="eastAsia"/>
-          <w:i/>
-          <w:iCs/>
-          <w:sz w:val="20"/>
-          <w:szCs w:val="20"/>
-        </w:rPr>
-      </w:pPr>
-      <w:r>
-        <w:rPr>
-          <w:i/>
-          <w:iCs/>
-          <w:sz w:val="20"/>
-          <w:szCs w:val="20"/>
-        </w:rPr>
-        <w:t>Moduł generatora zegara umieszczamy w module głównym projektu. W pozostałych modułach używamy tylko i wyłącznie sygnały zegara wygenerowane przez ten moduł.</w:t>
-      </w:r>
-    </w:p>
-    <w:p>
-      <w:pPr>
-        <w:pStyle w:val="Textbody"/>
-        <w:rPr>
-          <w:rFonts w:hint="eastAsia"/>
-        </w:rPr>
-      </w:pPr>
-      <w:r>
-        <w:rPr>
-          <w:i/>
-          <w:iCs/>
+        </w:rPr>
+      </w:pPr>
+      <w:r>
+        <w:rPr>
+          <w:rFonts w:hint="eastAsia"/>
           <w:noProof/>
-          <w:color w:val="FF0000"/>
-          <w:sz w:val="20"/>
-          <w:szCs w:val="20"/>
         </w:rPr>
         <w:drawing>
-          <wp:anchor distT="0" distB="0" distL="114300" distR="114300" simplePos="0" relativeHeight="251659264" behindDoc="0" locked="0" layoutInCell="1" allowOverlap="1" wp14:anchorId="1BA65F31" wp14:editId="589E8895">
-            <wp:simplePos x="0" y="0"/>
-            <wp:positionH relativeFrom="column">
-              <wp:posOffset>1094719</wp:posOffset>
-            </wp:positionH>
-            <wp:positionV relativeFrom="paragraph">
-              <wp:posOffset>684336</wp:posOffset>
-            </wp:positionV>
-            <wp:extent cx="3565428" cy="1471361"/>
-            <wp:effectExtent l="0" t="0" r="3272" b="1839"/>
-            <wp:wrapTopAndBottom/>
-            <wp:docPr id="1192836076" name="Obraz2"/>
-            <wp:cNvGraphicFramePr/>
+          <wp:inline distT="0" distB="0" distL="0" distR="0" wp14:anchorId="7D568B2A" wp14:editId="39A7AD02">
+            <wp:extent cx="3705225" cy="2114550"/>
+            <wp:effectExtent l="0" t="0" r="9525" b="0"/>
+            <wp:docPr id="1313256013" name="Obraz 1"/>
+            <wp:cNvGraphicFramePr>
+              <a:graphicFrameLocks xmlns:a="http://schemas.openxmlformats.org/drawingml/2006/main" noChangeAspect="1"/>
+            </wp:cNvGraphicFramePr>
             <a:graphic xmlns:a="http://schemas.openxmlformats.org/drawingml/2006/main">
               <a:graphicData uri="http://schemas.openxmlformats.org/drawingml/2006/picture">
                 <pic:pic xmlns:pic="http://schemas.openxmlformats.org/drawingml/2006/picture">
                   <pic:nvPicPr>
-                    <pic:cNvPr id="0" name=""/>
+                    <pic:cNvPr id="1313256013" name="Obraz 1313256013"/>
                     <pic:cNvPicPr/>
                   </pic:nvPicPr>
                   <pic:blipFill>
                     <a:blip r:embed="rId10">
-                      <a:lum/>
-                      <a:alphaModFix/>
+                      <a:extLst>
+                        <a:ext uri="{28A0092B-C50C-407E-A947-70E740481C1C}">
+                          <a14:useLocalDpi xmlns:a14="http://schemas.microsoft.com/office/drawing/2010/main" val="0"/>
+                        </a:ext>
+                      </a:extLst>
                     </a:blip>
-                    <a:srcRect/>
                     <a:stretch>
                       <a:fillRect/>
                     </a:stretch>
@@ -2893,32 +2840,17 @@
                   <pic:spPr>
                     <a:xfrm>
                       <a:off x="0" y="0"/>
-                      <a:ext cx="3565428" cy="1471361"/>
+                      <a:ext cx="3705225" cy="2114550"/>
                     </a:xfrm>
                     <a:prstGeom prst="rect">
                       <a:avLst/>
                     </a:prstGeom>
-                    <a:noFill/>
-                    <a:ln>
-                      <a:noFill/>
-                      <a:prstDash/>
-                    </a:ln>
                   </pic:spPr>
                 </pic:pic>
               </a:graphicData>
             </a:graphic>
-          </wp:anchor>
+          </wp:inline>
         </w:drawing>
-      </w:r>
-      <w:r>
-        <w:rPr>
-          <w:i/>
-          <w:iCs/>
-          <w:color w:val="FF0000"/>
-          <w:sz w:val="20"/>
-          <w:szCs w:val="20"/>
-        </w:rPr>
-        <w:t>Uwaga: jeżeli używamy różnych częstotliwości zegara w układzie, to należy je tak dobrać, aby były wielokrotnościami siebie (umożliwia to wygenerowanie tych sygnałów z jednego IP core generatora zegara i zapobiega problemom z synchronizacją).</w:t>
       </w:r>
     </w:p>
     <w:p>
@@ -3327,40 +3259,25 @@
         </w:rPr>
       </w:pPr>
       <w:r>
-        <w:t>Schemat połączenia ze sobą płytek Basys3 w trybie multiplayer.</w:t>
-      </w:r>
-    </w:p>
-    <w:p>
-      <w:pPr>
-        <w:pStyle w:val="Textbody"/>
+        <w:t>Płytki są połączone dwiema zworkami: jedną od masy do masy, drugą do pinu JA1 do pinu JA1.</w:t>
+      </w:r>
+      <w:r>
+        <w:br/>
+        <w:t>Klawiatura podłączona jest do portu USB</w:t>
+      </w:r>
+      <w:r>
+        <w:t>-A płytki MASTER. Wzmacniacz PMOD-AMP3 podłączony jest do złącza JC płytki MASTER. Monitor podłączony jest do portu VGA płytki SLAVE.</w:t>
+      </w:r>
+    </w:p>
+    <w:p>
+      <w:pPr>
+        <w:pStyle w:val="Nagwek1"/>
         <w:rPr>
           <w:rFonts w:hint="eastAsia"/>
         </w:rPr>
       </w:pPr>
       <w:r>
         <w:lastRenderedPageBreak/>
-        <w:t>Schematy podłączenia dodatkowych urządzeń peryferyjnych.</w:t>
-      </w:r>
-    </w:p>
-    <w:p>
-      <w:pPr>
-        <w:pStyle w:val="Textbody"/>
-        <w:rPr>
-          <w:rFonts w:hint="eastAsia"/>
-        </w:rPr>
-      </w:pPr>
-      <w:r>
-        <w:t>Konfiguracja zworek, przełączników, itp., jeśli inna niż domyślna.</w:t>
-      </w:r>
-    </w:p>
-    <w:p>
-      <w:pPr>
-        <w:pStyle w:val="Nagwek1"/>
-        <w:rPr>
-          <w:rFonts w:hint="eastAsia"/>
-        </w:rPr>
-      </w:pPr>
-      <w:r>
         <w:t>Film.</w:t>
       </w:r>
       <w:bookmarkEnd w:id="17"/>
@@ -3484,7 +3401,7 @@
         <w:rFonts w:hint="eastAsia"/>
         <w:noProof/>
       </w:rPr>
-      <w:t>11.08.2026</w:t>
+      <w:t>13.08.2026</w:t>
     </w:r>
     <w:r>
       <w:fldChar w:fldCharType="end"/>

</xml_diff>